<commit_message>
modal Requirement Review y FEcha PEP
</commit_message>
<xml_diff>
--- a/apps/pep/resources/pep_templates/pep_template.docx
+++ b/apps/pep/resources/pep_templates/pep_template.docx
@@ -3303,8 +3303,19 @@
                 <w:sz w:val="20"/>
                 <w:szCs w:val="20"/>
               </w:rPr>
-              <w:t>Scrum Master</w:t>
-            </w:r>
+              <w:t xml:space="preserve">Scrum </w:t>
+            </w:r>
+            <w:proofErr w:type="gramStart"/>
+            <w:r>
+              <w:rPr>
+                <w:rFonts w:ascii="Montserrat Medium" w:eastAsia="Montserrat Medium" w:hAnsi="Montserrat Medium" w:cs="Montserrat Medium"/>
+                <w:color w:val="595959"/>
+                <w:sz w:val="20"/>
+                <w:szCs w:val="20"/>
+              </w:rPr>
+              <w:t>Master</w:t>
+            </w:r>
+            <w:proofErr w:type="gramEnd"/>
           </w:p>
         </w:tc>
         <w:tc>
@@ -4088,14 +4099,25 @@
                 <w:szCs w:val="20"/>
               </w:rPr>
             </w:pPr>
-            <w:r>
-              <w:rPr>
-                <w:rFonts w:ascii="Montserrat Medium" w:eastAsia="Montserrat Medium" w:hAnsi="Montserrat Medium" w:cs="Montserrat Medium"/>
-                <w:color w:val="595959"/>
-                <w:sz w:val="20"/>
-                <w:szCs w:val="20"/>
-              </w:rPr>
-              <w:t>Asegurar que se cumplan con los requisitos, estándares y objetivos de buenas prácticas</w:t>
+            <w:proofErr w:type="gramStart"/>
+            <w:r>
+              <w:rPr>
+                <w:rFonts w:ascii="Montserrat Medium" w:eastAsia="Montserrat Medium" w:hAnsi="Montserrat Medium" w:cs="Montserrat Medium"/>
+                <w:color w:val="595959"/>
+                <w:sz w:val="20"/>
+                <w:szCs w:val="20"/>
+              </w:rPr>
+              <w:t>Asegurar</w:t>
+            </w:r>
+            <w:proofErr w:type="gramEnd"/>
+            <w:r>
+              <w:rPr>
+                <w:rFonts w:ascii="Montserrat Medium" w:eastAsia="Montserrat Medium" w:hAnsi="Montserrat Medium" w:cs="Montserrat Medium"/>
+                <w:color w:val="595959"/>
+                <w:sz w:val="20"/>
+                <w:szCs w:val="20"/>
+              </w:rPr>
+              <w:t xml:space="preserve"> que se cumplan con los requisitos, estándares y objetivos de buenas prácticas</w:t>
             </w:r>
           </w:p>
           <w:p>
@@ -4248,7 +4270,27 @@
           <w:sz w:val="20"/>
           <w:szCs w:val="20"/>
         </w:rPr>
-        <w:t xml:space="preserve">A continuación se describen las aplicaciones que se necesitan para completar el proceso del Software, así como su entorno y detalles. </w:t>
+        <w:t xml:space="preserve">A </w:t>
+      </w:r>
+      <w:proofErr w:type="gramStart"/>
+      <w:r>
+        <w:rPr>
+          <w:rFonts w:ascii="Montserrat Medium" w:eastAsia="Montserrat Medium" w:hAnsi="Montserrat Medium" w:cs="Montserrat Medium"/>
+          <w:color w:val="545454"/>
+          <w:sz w:val="20"/>
+          <w:szCs w:val="20"/>
+        </w:rPr>
+        <w:t>continuación</w:t>
+      </w:r>
+      <w:proofErr w:type="gramEnd"/>
+      <w:r>
+        <w:rPr>
+          <w:rFonts w:ascii="Montserrat Medium" w:eastAsia="Montserrat Medium" w:hAnsi="Montserrat Medium" w:cs="Montserrat Medium"/>
+          <w:color w:val="545454"/>
+          <w:sz w:val="20"/>
+          <w:szCs w:val="20"/>
+        </w:rPr>
+        <w:t xml:space="preserve"> se describen las aplicaciones que se necesitan para completar el proceso del Software, así como su entorno y detalles. </w:t>
       </w:r>
     </w:p>
     <w:p>
@@ -4607,8 +4649,21 @@
                 <w:sz w:val="20"/>
                 <w:szCs w:val="20"/>
               </w:rPr>
-              <w:t>Nombre de la  integración</w:t>
-            </w:r>
+              <w:t xml:space="preserve">Nombre de </w:t>
+            </w:r>
+            <w:proofErr w:type="gramStart"/>
+            <w:r>
+              <w:rPr>
+                <w:rFonts w:ascii="Montserrat" w:eastAsia="Montserrat" w:hAnsi="Montserrat" w:cs="Montserrat"/>
+                <w:b/>
+                <w:bCs/>
+                <w:color w:val="FFFFFF"/>
+                <w:sz w:val="20"/>
+                <w:szCs w:val="20"/>
+              </w:rPr>
+              <w:t>la  integración</w:t>
+            </w:r>
+            <w:proofErr w:type="gramEnd"/>
           </w:p>
         </w:tc>
         <w:tc>
@@ -5693,7 +5748,27 @@
           <w:sz w:val="20"/>
           <w:szCs w:val="20"/>
         </w:rPr>
-        <w:t>A continuación se describen los diferentes tipos de pruebas que se aplicarán a este proyecto</w:t>
+        <w:t xml:space="preserve">A </w:t>
+      </w:r>
+      <w:proofErr w:type="gramStart"/>
+      <w:r>
+        <w:rPr>
+          <w:rFonts w:ascii="Montserrat Medium" w:eastAsia="Montserrat Medium" w:hAnsi="Montserrat Medium" w:cs="Montserrat Medium"/>
+          <w:color w:val="595959"/>
+          <w:sz w:val="20"/>
+          <w:szCs w:val="20"/>
+        </w:rPr>
+        <w:t>continuación</w:t>
+      </w:r>
+      <w:proofErr w:type="gramEnd"/>
+      <w:r>
+        <w:rPr>
+          <w:rFonts w:ascii="Montserrat Medium" w:eastAsia="Montserrat Medium" w:hAnsi="Montserrat Medium" w:cs="Montserrat Medium"/>
+          <w:color w:val="595959"/>
+          <w:sz w:val="20"/>
+          <w:szCs w:val="20"/>
+        </w:rPr>
+        <w:t xml:space="preserve"> se describen los diferentes tipos de pruebas que se aplicarán a este proyecto</w:t>
       </w:r>
     </w:p>
     <w:p>
@@ -6667,7 +6742,31 @@
                 <w:sz w:val="20"/>
                 <w:szCs w:val="20"/>
               </w:rPr>
-              <w:t xml:space="preserve">Probar el 40% de los test Cases Creados </w:t>
+              <w:t xml:space="preserve">Probar el 40% de </w:t>
+            </w:r>
+            <w:proofErr w:type="gramStart"/>
+            <w:r>
+              <w:rPr>
+                <w:rFonts w:ascii="Montserrat Medium" w:eastAsia="Montserrat Medium" w:hAnsi="Montserrat Medium" w:cs="Montserrat Medium"/>
+                <w:i/>
+                <w:iCs/>
+                <w:color w:val="FF0000"/>
+                <w:sz w:val="20"/>
+                <w:szCs w:val="20"/>
+              </w:rPr>
+              <w:t>los test</w:t>
+            </w:r>
+            <w:proofErr w:type="gramEnd"/>
+            <w:r>
+              <w:rPr>
+                <w:rFonts w:ascii="Montserrat Medium" w:eastAsia="Montserrat Medium" w:hAnsi="Montserrat Medium" w:cs="Montserrat Medium"/>
+                <w:i/>
+                <w:iCs/>
+                <w:color w:val="FF0000"/>
+                <w:sz w:val="20"/>
+                <w:szCs w:val="20"/>
+              </w:rPr>
+              <w:t xml:space="preserve"> Cases Creados </w:t>
             </w:r>
           </w:p>
         </w:tc>
@@ -6803,7 +6902,31 @@
                 <w:sz w:val="20"/>
                 <w:szCs w:val="20"/>
               </w:rPr>
-              <w:t>Probar el 70% de los Test Cases Creados</w:t>
+              <w:t xml:space="preserve">Probar el 70% de </w:t>
+            </w:r>
+            <w:proofErr w:type="gramStart"/>
+            <w:r>
+              <w:rPr>
+                <w:rFonts w:ascii="Montserrat Medium" w:eastAsia="Montserrat Medium" w:hAnsi="Montserrat Medium" w:cs="Montserrat Medium"/>
+                <w:i/>
+                <w:iCs/>
+                <w:color w:val="FF0000"/>
+                <w:sz w:val="20"/>
+                <w:szCs w:val="20"/>
+              </w:rPr>
+              <w:t>los Test</w:t>
+            </w:r>
+            <w:proofErr w:type="gramEnd"/>
+            <w:r>
+              <w:rPr>
+                <w:rFonts w:ascii="Montserrat Medium" w:eastAsia="Montserrat Medium" w:hAnsi="Montserrat Medium" w:cs="Montserrat Medium"/>
+                <w:i/>
+                <w:iCs/>
+                <w:color w:val="FF0000"/>
+                <w:sz w:val="20"/>
+                <w:szCs w:val="20"/>
+              </w:rPr>
+              <w:t xml:space="preserve"> Cases Creados</w:t>
             </w:r>
           </w:p>
         </w:tc>
@@ -6939,7 +7062,31 @@
                 <w:sz w:val="20"/>
                 <w:szCs w:val="20"/>
               </w:rPr>
-              <w:t>Probar un 100% de los Test Cases Creados, incluyendo pruebas de rendimiento, etc.</w:t>
+              <w:t xml:space="preserve">Probar un 100% de </w:t>
+            </w:r>
+            <w:proofErr w:type="gramStart"/>
+            <w:r>
+              <w:rPr>
+                <w:rFonts w:ascii="Montserrat Medium" w:eastAsia="Montserrat Medium" w:hAnsi="Montserrat Medium" w:cs="Montserrat Medium"/>
+                <w:i/>
+                <w:iCs/>
+                <w:color w:val="FF0000"/>
+                <w:sz w:val="20"/>
+                <w:szCs w:val="20"/>
+              </w:rPr>
+              <w:t>los Test</w:t>
+            </w:r>
+            <w:proofErr w:type="gramEnd"/>
+            <w:r>
+              <w:rPr>
+                <w:rFonts w:ascii="Montserrat Medium" w:eastAsia="Montserrat Medium" w:hAnsi="Montserrat Medium" w:cs="Montserrat Medium"/>
+                <w:i/>
+                <w:iCs/>
+                <w:color w:val="FF0000"/>
+                <w:sz w:val="20"/>
+                <w:szCs w:val="20"/>
+              </w:rPr>
+              <w:t xml:space="preserve"> Cases Creados, incluyendo pruebas de rendimiento, etc.</w:t>
             </w:r>
           </w:p>
         </w:tc>
@@ -7537,7 +7684,27 @@
                 <w:iCs/>
                 <w:color w:val="FF0000"/>
               </w:rPr>
-              <w:t xml:space="preserve"> de los test cases no funcionales que se aplicarán</w:t>
+              <w:t xml:space="preserve"> de </w:t>
+            </w:r>
+            <w:proofErr w:type="gramStart"/>
+            <w:r>
+              <w:rPr>
+                <w:rFonts w:ascii="Montserrat Medium" w:eastAsia="Montserrat Medium" w:hAnsi="Montserrat Medium" w:cs="Montserrat Medium"/>
+                <w:i/>
+                <w:iCs/>
+                <w:color w:val="FF0000"/>
+              </w:rPr>
+              <w:t>los test</w:t>
+            </w:r>
+            <w:proofErr w:type="gramEnd"/>
+            <w:r>
+              <w:rPr>
+                <w:rFonts w:ascii="Montserrat Medium" w:eastAsia="Montserrat Medium" w:hAnsi="Montserrat Medium" w:cs="Montserrat Medium"/>
+                <w:i/>
+                <w:iCs/>
+                <w:color w:val="FF0000"/>
+              </w:rPr>
+              <w:t xml:space="preserve"> cases no funcionales que se aplicarán</w:t>
             </w:r>
           </w:p>
           <w:p>
@@ -7631,7 +7798,23 @@
                 <w:rFonts w:ascii="Montserrat Medium" w:eastAsia="Montserrat Medium" w:hAnsi="Montserrat Medium" w:cs="Montserrat Medium"/>
                 <w:color w:val="595959"/>
               </w:rPr>
-              <w:t>Para este tipo de prueba se valida y verifica el cumplimiento de los parámetros establecidos de RPA, de acuerdo al siguiente alcance:</w:t>
+              <w:t xml:space="preserve">Para este tipo de prueba se valida y verifica el cumplimiento de los parámetros establecidos de RPA, </w:t>
+            </w:r>
+            <w:proofErr w:type="gramStart"/>
+            <w:r>
+              <w:rPr>
+                <w:rFonts w:ascii="Montserrat Medium" w:eastAsia="Montserrat Medium" w:hAnsi="Montserrat Medium" w:cs="Montserrat Medium"/>
+                <w:color w:val="595959"/>
+              </w:rPr>
+              <w:t>de acuerdo al</w:t>
+            </w:r>
+            <w:proofErr w:type="gramEnd"/>
+            <w:r>
+              <w:rPr>
+                <w:rFonts w:ascii="Montserrat Medium" w:eastAsia="Montserrat Medium" w:hAnsi="Montserrat Medium" w:cs="Montserrat Medium"/>
+                <w:color w:val="595959"/>
+              </w:rPr>
+              <w:t xml:space="preserve"> siguiente alcance:</w:t>
             </w:r>
           </w:p>
           <w:p>
@@ -7763,7 +7946,39 @@
                 <w:rFonts w:ascii="Montserrat Medium" w:eastAsia="Montserrat Medium" w:hAnsi="Montserrat Medium" w:cs="Montserrat Medium"/>
                 <w:color w:val="595959"/>
               </w:rPr>
-              <w:t>Para este tipo de prueba se valida el control de seguridad del ambiente del sistema y  la exploración de vulnerabilidades de acuerdo al siguiente alcance:</w:t>
+              <w:t xml:space="preserve">Para este tipo de prueba se valida el control de seguridad del ambiente del sistema </w:t>
+            </w:r>
+            <w:proofErr w:type="gramStart"/>
+            <w:r>
+              <w:rPr>
+                <w:rFonts w:ascii="Montserrat Medium" w:eastAsia="Montserrat Medium" w:hAnsi="Montserrat Medium" w:cs="Montserrat Medium"/>
+                <w:color w:val="595959"/>
+              </w:rPr>
+              <w:t>y  la</w:t>
+            </w:r>
+            <w:proofErr w:type="gramEnd"/>
+            <w:r>
+              <w:rPr>
+                <w:rFonts w:ascii="Montserrat Medium" w:eastAsia="Montserrat Medium" w:hAnsi="Montserrat Medium" w:cs="Montserrat Medium"/>
+                <w:color w:val="595959"/>
+              </w:rPr>
+              <w:t xml:space="preserve"> exploración de vulnerabilidades </w:t>
+            </w:r>
+            <w:proofErr w:type="gramStart"/>
+            <w:r>
+              <w:rPr>
+                <w:rFonts w:ascii="Montserrat Medium" w:eastAsia="Montserrat Medium" w:hAnsi="Montserrat Medium" w:cs="Montserrat Medium"/>
+                <w:color w:val="595959"/>
+              </w:rPr>
+              <w:t>de acuerdo al</w:t>
+            </w:r>
+            <w:proofErr w:type="gramEnd"/>
+            <w:r>
+              <w:rPr>
+                <w:rFonts w:ascii="Montserrat Medium" w:eastAsia="Montserrat Medium" w:hAnsi="Montserrat Medium" w:cs="Montserrat Medium"/>
+                <w:color w:val="595959"/>
+              </w:rPr>
+              <w:t xml:space="preserve"> siguiente alcance:</w:t>
             </w:r>
           </w:p>
           <w:p>
@@ -7888,7 +8103,27 @@
           <w:sz w:val="20"/>
           <w:szCs w:val="20"/>
         </w:rPr>
-        <w:t>Esta sección contiene las pruebas fuera del alcance, pueden incluir sistemas de integración o partes de otros software, el cual tengan interacción directa, pero no entren dentro del alcance de las pruebas.</w:t>
+        <w:t xml:space="preserve">Esta sección contiene las pruebas fuera del alcance, pueden incluir sistemas de integración o partes de </w:t>
+      </w:r>
+      <w:proofErr w:type="gramStart"/>
+      <w:r>
+        <w:rPr>
+          <w:rFonts w:ascii="Montserrat Medium" w:eastAsia="Montserrat Medium" w:hAnsi="Montserrat Medium" w:cs="Montserrat Medium"/>
+          <w:color w:val="595959"/>
+          <w:sz w:val="20"/>
+          <w:szCs w:val="20"/>
+        </w:rPr>
+        <w:t>otros software</w:t>
+      </w:r>
+      <w:proofErr w:type="gramEnd"/>
+      <w:r>
+        <w:rPr>
+          <w:rFonts w:ascii="Montserrat Medium" w:eastAsia="Montserrat Medium" w:hAnsi="Montserrat Medium" w:cs="Montserrat Medium"/>
+          <w:color w:val="595959"/>
+          <w:sz w:val="20"/>
+          <w:szCs w:val="20"/>
+        </w:rPr>
+        <w:t>, el cual tengan interacción directa, pero no entren dentro del alcance de las pruebas.</w:t>
       </w:r>
     </w:p>
     <w:tbl>
@@ -8000,7 +8235,27 @@
                 <w:iCs/>
                 <w:color w:val="FF0000"/>
               </w:rPr>
-              <w:t>Listar las funcionalidades, sistemas o requerimientos que no se aplicarán pruebas así como el motivo del porqué no se probará</w:t>
+              <w:t xml:space="preserve">Listar las funcionalidades, sistemas o requerimientos que no se aplicarán </w:t>
+            </w:r>
+            <w:proofErr w:type="gramStart"/>
+            <w:r>
+              <w:rPr>
+                <w:rFonts w:ascii="Montserrat Medium" w:eastAsia="Montserrat Medium" w:hAnsi="Montserrat Medium" w:cs="Montserrat Medium"/>
+                <w:i/>
+                <w:iCs/>
+                <w:color w:val="FF0000"/>
+              </w:rPr>
+              <w:t>pruebas</w:t>
+            </w:r>
+            <w:proofErr w:type="gramEnd"/>
+            <w:r>
+              <w:rPr>
+                <w:rFonts w:ascii="Montserrat Medium" w:eastAsia="Montserrat Medium" w:hAnsi="Montserrat Medium" w:cs="Montserrat Medium"/>
+                <w:i/>
+                <w:iCs/>
+                <w:color w:val="FF0000"/>
+              </w:rPr>
+              <w:t xml:space="preserve"> así como el motivo del porqué no se probará</w:t>
             </w:r>
           </w:p>
           <w:p>
@@ -8379,6 +8634,7 @@
                 <w:szCs w:val="20"/>
               </w:rPr>
             </w:pPr>
+            <w:proofErr w:type="gramStart"/>
             <w:r>
               <w:rPr>
                 <w:rFonts w:ascii="Montserrat" w:eastAsia="Montserrat" w:hAnsi="Montserrat" w:cs="Montserrat"/>
@@ -8388,7 +8644,19 @@
                 <w:sz w:val="20"/>
                 <w:szCs w:val="20"/>
               </w:rPr>
-              <w:t>Link Google Drive</w:t>
+              <w:t>Link</w:t>
+            </w:r>
+            <w:proofErr w:type="gramEnd"/>
+            <w:r>
+              <w:rPr>
+                <w:rFonts w:ascii="Montserrat" w:eastAsia="Montserrat" w:hAnsi="Montserrat" w:cs="Montserrat"/>
+                <w:b/>
+                <w:bCs/>
+                <w:color w:val="FFFFFF"/>
+                <w:sz w:val="20"/>
+                <w:szCs w:val="20"/>
+              </w:rPr>
+              <w:t xml:space="preserve"> Google Drive</w:t>
             </w:r>
           </w:p>
         </w:tc>
@@ -8909,7 +9177,31 @@
           <w:sz w:val="20"/>
           <w:szCs w:val="20"/>
         </w:rPr>
-        <w:t>Este apartado se llena conforme va avanzando el proyecto, si alguna no requirió cambios, aun así se llenan los apartados. Si no aplico alguna se remueve de la tabla.</w:t>
+        <w:t xml:space="preserve">Este apartado se llena conforme va avanzando el proyecto, si alguna no requirió cambios, aun </w:t>
+      </w:r>
+      <w:proofErr w:type="gramStart"/>
+      <w:r>
+        <w:rPr>
+          <w:rFonts w:ascii="Montserrat Medium" w:eastAsia="Montserrat Medium" w:hAnsi="Montserrat Medium" w:cs="Montserrat Medium"/>
+          <w:i/>
+          <w:iCs/>
+          <w:color w:val="FF0000"/>
+          <w:sz w:val="20"/>
+          <w:szCs w:val="20"/>
+        </w:rPr>
+        <w:t>así</w:t>
+      </w:r>
+      <w:proofErr w:type="gramEnd"/>
+      <w:r>
+        <w:rPr>
+          <w:rFonts w:ascii="Montserrat Medium" w:eastAsia="Montserrat Medium" w:hAnsi="Montserrat Medium" w:cs="Montserrat Medium"/>
+          <w:i/>
+          <w:iCs/>
+          <w:color w:val="FF0000"/>
+          <w:sz w:val="20"/>
+          <w:szCs w:val="20"/>
+        </w:rPr>
+        <w:t xml:space="preserve"> se llenan los apartados. Si no aplico alguna se remueve de la tabla.</w:t>
       </w:r>
     </w:p>
     <w:p>
@@ -9349,7 +9641,7 @@
                 <w:sz w:val="20"/>
                 <w:szCs w:val="20"/>
               </w:rPr>
-              <w:t>Date_issue</w:t>
+              <w:t>Date_issue_table</w:t>
             </w:r>
             <w:proofErr w:type="spellEnd"/>
           </w:p>
@@ -10341,7 +10633,31 @@
                 <w:sz w:val="20"/>
                 <w:szCs w:val="20"/>
               </w:rPr>
-              <w:t xml:space="preserve">Versión 2 del Plan estratégico de pruebas con cambios en los punto </w:t>
+              <w:t xml:space="preserve">Versión 2 del Plan estratégico de pruebas con cambios en </w:t>
+            </w:r>
+            <w:proofErr w:type="gramStart"/>
+            <w:r>
+              <w:rPr>
+                <w:rFonts w:ascii="Montserrat Medium" w:eastAsia="Montserrat Medium" w:hAnsi="Montserrat Medium" w:cs="Montserrat Medium"/>
+                <w:i/>
+                <w:iCs/>
+                <w:color w:val="FF0000"/>
+                <w:sz w:val="20"/>
+                <w:szCs w:val="20"/>
+              </w:rPr>
+              <w:t>los punto</w:t>
+            </w:r>
+            <w:proofErr w:type="gramEnd"/>
+            <w:r>
+              <w:rPr>
+                <w:rFonts w:ascii="Montserrat Medium" w:eastAsia="Montserrat Medium" w:hAnsi="Montserrat Medium" w:cs="Montserrat Medium"/>
+                <w:i/>
+                <w:iCs/>
+                <w:color w:val="FF0000"/>
+                <w:sz w:val="20"/>
+                <w:szCs w:val="20"/>
+              </w:rPr>
+              <w:t xml:space="preserve"> </w:t>
             </w:r>
           </w:p>
         </w:tc>
@@ -13138,7 +13454,6 @@
   <w:style w:type="character" w:default="1" w:styleId="Fuentedeprrafopredeter">
     <w:name w:val="Default Paragraph Font"/>
     <w:uiPriority w:val="1"/>
-    <w:semiHidden/>
     <w:unhideWhenUsed/>
   </w:style>
   <w:style w:type="table" w:default="1" w:styleId="Tablanormal">

</xml_diff>